<commit_message>
Adiciona Brunno Passos e Caio Vinicius como autores do artigo
</commit_message>
<xml_diff>
--- a/artigo/artigo-oficina-sbc.docx
+++ b/artigo/artigo-oficina-sbc.docx
@@ -47,7 +47,7 @@
           <w:sz w:val="24"/>
           <w:szCs w:val="24"/>
         </w:rPr>
-        <w:t xml:space="preserve">Jarlisson Brito Santos¹, [Integrante 2]¹, [Integrante 3]¹, [Integrante 4]¹</w:t>
+        <w:t xml:space="preserve">Jarlisson Brito Santos¹, Brunno Passos¹, Caio Vinicius¹</w:t>
       </w:r>
     </w:p>
     <w:p>
@@ -113,7 +113,7 @@
           <w:sz w:val="15"/>
           <w:szCs w:val="15"/>
         </w:rPr>
-        <w:t xml:space="preserve">{[email1],[email2],[email3],[email4]}@souunit.com.br</w:t>
+        <w:t xml:space="preserve">britojarlisson64@gmail.com, brunnopassos1@gmail.com, caiovinicius200361@gmail.com</w:t>
       </w:r>
     </w:p>
     <w:p>

</xml_diff>